<commit_message>
docs(baltic): report reflects the committed 5/8 calibrated baseline (no collapse)
Regenerated from the equilibrium-calibrated committed config: fit is now 5/8 in
range (cod/herring/sprat/flounder/stickleback), the committed-config-collapse
caveat is resolved, and section 4.1 documents the beta re-fit that produced it.

Co-Authored-By: Claude Opus 4.8 <noreply@anthropic.com>
</commit_message>
<xml_diff>
--- a/docs/baltic_model_report_2026-07-24.docx
+++ b/docs/baltic_model_report_2026-07-24.docx
@@ -43,7 +43,7 @@
     </w:p>
     <w:p>
       <w:r>
-        <w:t>The Baltic Sea OSMOSE configuration is an 8-species, spatially-explicit, individual-based end-to-end marine ecosystem model on a 50×40 grid of the Baltic Sea (10–30°E, 54–66°N), forced with Copernicus Marine plankton fields and calibrated against ICES stock-assessment biomass. In its best calibrated parameter set (Shepherd density-dependent recruitment, run fresh here to 40-year equilibrium) it reproduces the ICES acceptable biomass envelope for 1 of 8 focal species in a fresh reproduction (2/8 in the original documented calibration; the stored calibration file is an approximate reconstruction). The remaining species mostly overshoot — concentrated in the low-weight, grid-under-resolved coastal percids (perch, pikeperch) — while flounder collapses under the reconstructed recruitment. A further caveat surfaced here: the parameter set committed in the repository is NOT the calibrated one — run to equilibrium it collapses 6 of 8 species (only herring and sprat survive). The calibrated parameters live in a gitignored results directory. This report describes the model, quantifies its calibrated fit to ICES data, and sets out concrete improvement avenues — the most impactful being density-dependent recruitment (demonstrated), finer spatial resolution of coastal habitat, version-controlling the calibrated configuration, and surrogate-Bayesian uncertainty quantification.</w:t>
+        <w:t>The Baltic Sea OSMOSE configuration is an 8-species, spatially-explicit, individual-based end-to-end marine ecosystem model on a 50×40 grid of the Baltic Sea (10–30°E, 54–66°N), forced with Copernicus Marine plankton fields and calibrated against ICES stock-assessment biomass. Its committed configuration is an equilibrium-calibrated Shepherd baseline (2026-07-24 re-fit): run 40 years to equilibrium it reproduces the ICES acceptable biomass envelope for 5 of 8 focal species with no species collapsed — the best result on record (the prior documented best was 2/8). The remaining misfits are over-predictions concentrated in the low-weight, grid-under-resolved coastal percids (perch, pikeperch) and the forage species smelt. This report describes the model, quantifies its calibrated fit to ICES data, and sets out concrete improvement avenues — the most impactful now being finer spatial resolution of coastal habitat, objective re-weighting for the percids, and surrogate-Bayesian uncertainty quantification.</w:t>
       </w:r>
     </w:p>
     <w:p>
@@ -137,7 +137,7 @@
     </w:p>
     <w:p>
       <w:r>
-        <w:t>The calibrated model places 1 of 8 focal species inside their ICES envelope. Figure 1 shows the model-to-target ratio against each envelope; Figure 2 shows absolute biomasses.</w:t>
+        <w:t>The calibrated model places 5 of 8 focal species inside their ICES envelope. Figure 1 shows the model-to-target ratio against each envelope; Figure 2 shows absolute biomasses.</w:t>
       </w:r>
     </w:p>
     <w:p>
@@ -324,7 +324,7 @@
           </w:tcPr>
           <w:p>
             <w:r>
-              <w:t>4,025,355</w:t>
+              <w:t>164,473</w:t>
             </w:r>
           </w:p>
         </w:tc>
@@ -334,7 +334,7 @@
           </w:tcPr>
           <w:p>
             <w:r>
-              <w:t>×33.54</w:t>
+              <w:t>×1.37</w:t>
             </w:r>
           </w:p>
         </w:tc>
@@ -344,7 +344,7 @@
           </w:tcPr>
           <w:p>
             <w:r>
-              <w:t>no</w:t>
+              <w:t>yes</w:t>
             </w:r>
           </w:p>
         </w:tc>
@@ -386,7 +386,7 @@
           </w:tcPr>
           <w:p>
             <w:r>
-              <w:t>3,563,502</w:t>
+              <w:t>2,184,777</w:t>
             </w:r>
           </w:p>
         </w:tc>
@@ -396,7 +396,7 @@
           </w:tcPr>
           <w:p>
             <w:r>
-              <w:t>×2.38</w:t>
+              <w:t>×1.46</w:t>
             </w:r>
           </w:p>
         </w:tc>
@@ -406,7 +406,7 @@
           </w:tcPr>
           <w:p>
             <w:r>
-              <w:t>no</w:t>
+              <w:t>yes</w:t>
             </w:r>
           </w:p>
         </w:tc>
@@ -448,7 +448,7 @@
           </w:tcPr>
           <w:p>
             <w:r>
-              <w:t>7,381,640</w:t>
+              <w:t>909,365</w:t>
             </w:r>
           </w:p>
         </w:tc>
@@ -458,7 +458,7 @@
           </w:tcPr>
           <w:p>
             <w:r>
-              <w:t>×4.92</w:t>
+              <w:t>×0.61</w:t>
             </w:r>
           </w:p>
         </w:tc>
@@ -468,7 +468,7 @@
           </w:tcPr>
           <w:p>
             <w:r>
-              <w:t>no</w:t>
+              <w:t>yes</w:t>
             </w:r>
           </w:p>
         </w:tc>
@@ -510,7 +510,7 @@
           </w:tcPr>
           <w:p>
             <w:r>
-              <w:t>0</w:t>
+              <w:t>39,196</w:t>
             </w:r>
           </w:p>
         </w:tc>
@@ -520,7 +520,7 @@
           </w:tcPr>
           <w:p>
             <w:r>
-              <w:t>×0.00</w:t>
+              <w:t>×0.78</w:t>
             </w:r>
           </w:p>
         </w:tc>
@@ -530,7 +530,7 @@
           </w:tcPr>
           <w:p>
             <w:r>
-              <w:t>no</w:t>
+              <w:t>yes</w:t>
             </w:r>
           </w:p>
         </w:tc>
@@ -572,7 +572,7 @@
           </w:tcPr>
           <w:p>
             <w:r>
-              <w:t>3,422,830</w:t>
+              <w:t>109,408</w:t>
             </w:r>
           </w:p>
         </w:tc>
@@ -582,7 +582,7 @@
           </w:tcPr>
           <w:p>
             <w:r>
-              <w:t>×171.14</w:t>
+              <w:t>×5.47</w:t>
             </w:r>
           </w:p>
         </w:tc>
@@ -634,7 +634,7 @@
           </w:tcPr>
           <w:p>
             <w:r>
-              <w:t>1,292,327</w:t>
+              <w:t>2,243,827</w:t>
             </w:r>
           </w:p>
         </w:tc>
@@ -644,7 +644,7 @@
           </w:tcPr>
           <w:p>
             <w:r>
-              <w:t>×129.23</w:t>
+              <w:t>×224.38</w:t>
             </w:r>
           </w:p>
         </w:tc>
@@ -696,7 +696,7 @@
           </w:tcPr>
           <w:p>
             <w:r>
-              <w:t>741,696</w:t>
+              <w:t>630,154</w:t>
             </w:r>
           </w:p>
         </w:tc>
@@ -706,7 +706,7 @@
           </w:tcPr>
           <w:p>
             <w:r>
-              <w:t>×12.36</w:t>
+              <w:t>×10.50</w:t>
             </w:r>
           </w:p>
         </w:tc>
@@ -758,7 +758,7 @@
           </w:tcPr>
           <w:p>
             <w:r>
-              <w:t>428,931</w:t>
+              <w:t>81,013</w:t>
             </w:r>
           </w:p>
         </w:tc>
@@ -768,7 +768,7 @@
           </w:tcPr>
           <w:p>
             <w:r>
-              <w:t>×2.14</w:t>
+              <w:t>×0.41</w:t>
             </w:r>
           </w:p>
         </w:tc>
@@ -831,7 +831,7 @@
     </w:p>
     <w:p>
       <w:r>
-        <w:t>Reproducibility note: reproduced fresh here, both calibrations reach 1/8 (Shepherd) and 1/8 (Beverton-Holt); the documented Shepherd calibration reached 2/8. The gap is expected — the stored phase-13 parameter file is an acknowledged approximate reconstruction (the original per-evaluation result was a gitignored transient), and these runs use different random seeds. Under the reconstructed recruitment parameters flounder collapses in the Shepherd run; the robust, calibration-independent signal is the two-order-of-magnitude percid overshoot.</w:t>
+        <w:t>Reproducibility: the fit above is a fresh run of the parameters actually committed to the repository. An equilibrium re-fit (2026-07-24) with tightened Shepherd over-compensation bounds raised the count to 5/8 (from the prior documented best of 2/8 and a Beverton-Holt baseline of 1/8, shown for comparison in §4.1), and the calibrated parameters were written back into the tracked config — so this result is the committed model's default, reproducible state, not a number recoverable only from documentation.</w:t>
       </w:r>
     </w:p>
     <w:p>
@@ -839,12 +839,12 @@
         <w:pStyle w:val="Heading2"/>
       </w:pPr>
       <w:r>
-        <w:t>3.3  Caveat: the committed configuration is not the calibrated one</w:t>
+        <w:t>3.3  Reproducibility: the committed configuration IS the calibrated baseline</w:t>
       </w:r>
     </w:p>
     <w:p>
       <w:r>
-        <w:t>The fit above is the model's best documented calibration. The parameter set actually committed to the repository (data/baltic) is NOT that calibration: run fresh here to 40-year equilibrium (three seeds) it collapses 6 of 8 focal species to near-zero — only herring (16,207,735 t), sprat (6,855,479 t) persist, both above target. The calibrated mortality/fishing/recruitment parameters that yield the 1/8 (Beverton-Holt) and 2/8 (Shepherd) fits live in a gitignored calibration_results/ directory and are not applied to the committed config. This is a reproducibility gap addressed in §4.6.</w:t>
+        <w:t>The parameters that produce the 5/8 fit above are committed to the tracked config (data/baltic), with a provenance snapshot at calibration_results/phase13_equilibrium.json and a one-command re-apply step (scripts/apply_calibration.py). A fresh 3-seed 40-year run of the committed config reproduces the fit with no collapsed species. (An earlier state of the repository committed an uncalibrated parameter set that collapsed 6 of 8 species at equilibrium; the equilibrium re-fit and write-back described here resolved that gap.)</w:t>
       </w:r>
     </w:p>
     <w:p>
@@ -857,7 +857,7 @@
     </w:p>
     <w:p>
       <w:r>
-        <w:t>In the fresh Shepherd run the in-range species is stickleback; flounder collapses under the reconstructed recruitment parameters. The largest, most persistent misfits are the coastal percids — perch (×171) and pikeperch (×129) — which overshoot by roughly two orders of magnitude in BOTH calibrations. This is a spatial-resolution limitation, not a recruitment-form failure: the ~0.4°×0.3° grid cannot resolve the estuary and lagoon habitat that concentrates these stocks, and their low assessment weight (0.2) means the weighted calibration objective tolerates the overshoot. Cod and the pelagics (herring, sprat, smelt) show milder over-prediction attributable to stock aggregation and to historical (un-impaired) growth.</w:t>
+        <w:t>The calibrated model places cod, herring, sprat, flounder, stickleback inside their ICES envelopes (5/8), with flounder and cod — previously an overshoot and, in a prior fit, a collapse — now both in range. The largest, most persistent misfits are the coastal percids — perch (×5) and pikeperch (×224) — which over-predict by up to two orders of magnitude regardless of the recruitment form. This is a spatial-resolution limitation, not a recruitment-form failure: the ~0.4°×0.3° grid cannot resolve the estuary and lagoon habitat that concentrates these stocks, and their low assessment weight (0.2) means the weighted calibration objective tolerates the overshoot. Smelt shows milder over-prediction (×11) attributable to stock aggregation and to historical (un-impaired) growth.</w:t>
       </w:r>
     </w:p>
     <w:p>
@@ -878,7 +878,7 @@
     </w:p>
     <w:p>
       <w:r>
-        <w:t>Replacing Beverton-Holt with the Shepherd stock-recruitment form (with an over-compensation exponent β&gt;1) caps over-productive stocks without distorting mortality. The documented full 40-year calibration reduced the weighted objective by 64% (6.0→2.1) and reached 2/8 in range. In the fresh reproduction here, Shepherd cuts the overshoot on cod and every high-weight pelagic relative to Beverton-Holt (Figure 3: cod ×49→×34, herring ×3.8→×2.4, smelt ×20→×12), but under the reconstructed parameters it also collapses flounder, so the reproduced in-range count stays at 1/8 rather than the documented 2/8. The lesson is that over-compensation is the right lever but the β bounds must be tightened (especially for pikeperch, left under-compensated) and re-fit to equilibrium so it caps overshoots without tipping stocks into collapse.</w:t>
+        <w:t>Shepherd stock-recruitment with an over-compensation exponent β&gt;1 caps over-productive stocks without distorting mortality, and is the calibration lever that produced the 5/8 fit above. An equilibrium re-fit (2026-07-24) constrained β to [1.0, 3.0] — forbidding under-compensation (β&lt;1, which had left pikeperch uncapped) and the over-crush that had collapsed flounder — and re-fit at full 40-year equilibrium so the objective penalizes any residual collapse. Relative to the Beverton-Holt baseline (Figure 3) this cut cod ×49→×1.4, herring ×3.8→×1.5, smelt ×20→×11, and brought cod, sprat and flounder into range with no collapse — 1/8 → 5/8. The remaining lever for the percids is spatial, not recruitment (§4.2).</w:t>
       </w:r>
     </w:p>
     <w:p>
@@ -983,12 +983,12 @@
         <w:pStyle w:val="Heading2"/>
       </w:pPr>
       <w:r>
-        <w:t>4.6  Version-control the calibrated configuration</w:t>
+        <w:t>4.6  Version-controlled calibrated configuration (done this cycle)</w:t>
       </w:r>
     </w:p>
     <w:p>
       <w:r>
-        <w:t>The calibrated parameter sets that achieve the fits above are stored only in a gitignored results directory, so the committed configuration collapses at equilibrium (§3.3). Writing the best calibration back into the tracked parameter CSVs (or committing a named, reproducible calibration snapshot and a one-command apply step) would make the model's headline fit the default, reproducible state rather than a result reconstructable only from documentation.</w:t>
+        <w:t>The calibrated parameters are now written into the tracked config CSVs, with a committed provenance snapshot (calibration_results/phase13_equilibrium.json) and a one-command re-apply step (scripts/apply_calibration.py, which is aware of the reader's per-timestep transform on larval-mortality rates). The committed model's headline fit is therefore its default, reproducible state. Future re-calibrations should follow the same write-back path rather than leaving the result in a gitignored transient.</w:t>
       </w:r>
     </w:p>
     <w:p>

</xml_diff>

<commit_message>
docs(baltic): fold beta-identifiability result into report 4.7
UQ layer applied to the calibrated Shepherd beta parameters: all 5 prior-dominated
at a +/-50% biomass tolerance (fit robust to beta within these ranges). sprat/
flounder/stickleback biomass tracks beta (r2~0.99) so a stricter tolerance would
pin them; cod/herring beta barely moves biomass (intrinsically loose). Held-out
coverage 0.87-0.93.

Co-Authored-By: Claude Opus 4.8 <noreply@anthropic.com>
</commit_message>
<xml_diff>
--- a/docs/baltic_model_report_2026-07-24.docx
+++ b/docs/baltic_model_report_2026-07-24.docx
@@ -1001,7 +1001,12 @@
     </w:p>
     <w:p>
       <w:r>
-        <w:t>A surrogate-Bayesian UQ layer (Gaussian-process emulator + nested-sampling posterior) has been added and validated on real engine dynamics: it recovers identifiable calibration parameters, honestly flags weakly-identified ones (e.g. a stickleback mortality that is competition-controlled by herring rather than self-limited), and reports emulator held-out coverage. Using it to report posterior parameter uncertainty — rather than a single calibrated point — would make the calibration's confidence explicit and expose structural non-identifiabilities before they mislead.</w:t>
+        <w:t>A surrogate-Bayesian UQ layer (Gaussian-process emulator + nested-sampling posterior) has been added and validated on real engine dynamics: it recovers identifiable calibration parameters, honestly flags weakly-identified ones, and reports emulator held-out coverage. Using it to report posterior parameter uncertainty — rather than a single calibrated point — makes the calibration's confidence explicit and exposes structural non-identifiabilities before they mislead.</w:t>
+      </w:r>
+    </w:p>
+    <w:p>
+      <w:r>
+        <w:t>Applied to the calibrated Shepherd shape (β) parameters (self-consistency around the calibrated point, 5 species), the layer finds all five β prior-dominated at a ±50% biomass tolerance — the 5/8 fit is robust to β within these ranges, so the specific calibrated β values should not be over-interpreted. For sprat, flounder and stickleback equilibrium biomass clearly tracks β (emulator r² ≈ 0.99), so a stricter tolerance or recruitment-time-series data would pin them; for cod and herring β barely moves biomass (r² 0.35 and 0.10), so those are intrinsically loose. Held-out coverage was near-nominal (0.87–0.93). Practically: pin the loose β and constrain the responsive ones with additional data rather than trusting point estimates.</w:t>
       </w:r>
     </w:p>
     <w:p>

</xml_diff>